<commit_message>
Update resources/copyright_form.docx and other recent changes
</commit_message>
<xml_diff>
--- a/resources/copyright_form.docx
+++ b/resources/copyright_form.docx
@@ -115,9 +115,8 @@
         <w:autoSpaceDN w:val="0"/>
         <w:adjustRightInd w:val="0"/>
         <w:rPr>
-          <w:b/>
-          <w:sz w:val="24"/>
-          <w:szCs w:val="24"/>
+          <w:sz w:val="18"/>
+          <w:szCs w:val="18"/>
         </w:rPr>
       </w:pPr>
       <w:r>
@@ -144,7 +143,7 @@
           <w:szCs w:val="24"/>
           <w:lang w:val="en-GB" w:eastAsia="de-AT"/>
         </w:rPr>
-        <w:t>2011 International</w:t>
+        <w:t>20</w:t>
       </w:r>
       <w:r>
         <w:rPr>
@@ -153,7 +152,7 @@
           <w:szCs w:val="24"/>
           <w:lang w:val="en-GB" w:eastAsia="de-AT"/>
         </w:rPr>
-        <w:t xml:space="preserve"> </w:t>
+        <w:t xml:space="preserve">27 </w:t>
       </w:r>
       <w:r>
         <w:rPr>
@@ -162,7 +161,7 @@
           <w:szCs w:val="24"/>
           <w:lang w:val="en-GB" w:eastAsia="de-AT"/>
         </w:rPr>
-        <w:t xml:space="preserve">Conference </w:t>
+        <w:t>2nd International Conference on Communication, Computing and Energy Efficient Technologies</w:t>
       </w:r>
       <w:r>
         <w:rPr>
@@ -171,46 +170,8 @@
           <w:szCs w:val="24"/>
           <w:lang w:val="en-GB" w:eastAsia="de-AT"/>
         </w:rPr>
-        <w:t>on</w:t>
-      </w:r>
-      <w:r>
-        <w:rPr>
-          <w:b/>
-          <w:sz w:val="24"/>
-          <w:szCs w:val="24"/>
-          <w:lang w:val="en-GB" w:eastAsia="de-AT"/>
-        </w:rPr>
-        <w:t xml:space="preserve"> Image Information Processing </w:t>
-      </w:r>
-      <w:r>
-        <w:rPr>
-          <w:b/>
-          <w:sz w:val="24"/>
-          <w:szCs w:val="24"/>
-        </w:rPr>
-        <w:t xml:space="preserve">   (ICIIP - 2011</w:t>
-      </w:r>
-      <w:r>
-        <w:rPr>
-          <w:b/>
-          <w:sz w:val="24"/>
-          <w:szCs w:val="24"/>
-        </w:rPr>
-        <w:t>)</w:t>
-      </w:r>
-    </w:p>
-    <w:p>
-      <w:pPr>
-        <w:pStyle w:val="Heading3"/>
-        <w:widowControl w:val="0"/>
-        <w:spacing w:after="0"/>
-        <w:ind w:left="-90" w:right="-180"/>
-        <w:rPr>
-          <w:rFonts w:ascii="Times New Roman" w:hAnsi="Times New Roman"/>
-          <w:sz w:val="18"/>
-          <w:szCs w:val="18"/>
-        </w:rPr>
-      </w:pPr>
+        <w:t xml:space="preserve"> (I3CEET-2027)</w:t>
+      </w:r>
     </w:p>
     <w:p>
       <w:pPr>
@@ -449,7 +410,6 @@
       <w:pPr>
         <w:ind w:right="-270"/>
         <w:rPr>
-          <w:rFonts w:hint="eastAsia"/>
           <w:vanish/>
           <w:color w:val="0000FF"/>
           <w:szCs w:val="24"/>
@@ -702,8 +662,8 @@
           <w:szCs w:val="18"/>
         </w:rPr>
       </w:pPr>
-      <w:smartTag w:uri="urn:schemas-microsoft-com:office:smarttags" w:element="country-region">
-        <w:smartTag w:uri="urn:schemas-microsoft-com:office:smarttags" w:element="place">
+      <w:smartTag w:uri="urn:schemas-microsoft-com:office:smarttags" w:element="place">
+        <w:smartTag w:uri="urn:schemas-microsoft-com:office:smarttags" w:element="country-region">
           <w:r>
             <w:rPr>
               <w:rFonts w:ascii="Times New Roman" w:hAnsi="Times New Roman"/>
@@ -745,6 +705,137 @@
       <w:r>
         <w:t xml:space="preserve">This will certify that all authors of the Work are </w:t>
       </w:r>
+      <w:smartTag w:uri="urn:schemas-microsoft-com:office:smarttags" w:element="place">
+        <w:smartTag w:uri="urn:schemas-microsoft-com:office:smarttags" w:element="country-region">
+          <w:r>
+            <w:t>U.S.</w:t>
+          </w:r>
+        </w:smartTag>
+      </w:smartTag>
+      <w:r>
+        <w:t xml:space="preserve"> government employees and prepared the Work on a subject within the scope of their official duties.  As such, the Work is not subject to </w:t>
+      </w:r>
+      <w:smartTag w:uri="urn:schemas-microsoft-com:office:smarttags" w:element="place">
+        <w:smartTag w:uri="urn:schemas-microsoft-com:office:smarttags" w:element="country-region">
+          <w:r>
+            <w:t>U.S.</w:t>
+          </w:r>
+        </w:smartTag>
+      </w:smartTag>
+      <w:r>
+        <w:t xml:space="preserve"> copyright protection.</w:t>
+      </w:r>
+    </w:p>
+    <w:p>
+      <w:pPr>
+        <w:pStyle w:val="EndnoteText"/>
+        <w:widowControl/>
+        <w:ind w:right="-270"/>
+        <w:rPr>
+          <w:sz w:val="18"/>
+        </w:rPr>
+      </w:pPr>
+    </w:p>
+    <w:p>
+      <w:pPr>
+        <w:widowControl/>
+        <w:ind w:right="-270"/>
+        <w:rPr>
+          <w:b/>
+        </w:rPr>
+      </w:pPr>
+      <w:r>
+        <w:rPr>
+          <w:b/>
+        </w:rPr>
+        <w:t>(2)_____________________________________________________________</w:t>
+      </w:r>
+      <w:r>
+        <w:rPr>
+          <w:b/>
+        </w:rPr>
+        <w:tab/>
+      </w:r>
+      <w:r>
+        <w:rPr>
+          <w:b/>
+        </w:rPr>
+        <w:tab/>
+        <w:t>___________________________________</w:t>
+      </w:r>
+    </w:p>
+    <w:p>
+      <w:pPr>
+        <w:widowControl/>
+        <w:ind w:right="-270" w:firstLine="270"/>
+        <w:rPr>
+          <w:b/>
+        </w:rPr>
+      </w:pPr>
+      <w:r>
+        <w:rPr>
+          <w:b/>
+        </w:rPr>
+        <w:t xml:space="preserve">Authorized Signature </w:t>
+      </w:r>
+      <w:r>
+        <w:rPr>
+          <w:b/>
+        </w:rPr>
+        <w:tab/>
+      </w:r>
+      <w:r>
+        <w:rPr>
+          <w:b/>
+        </w:rPr>
+        <w:tab/>
+      </w:r>
+      <w:r>
+        <w:rPr>
+          <w:b/>
+        </w:rPr>
+        <w:tab/>
+      </w:r>
+      <w:r>
+        <w:rPr>
+          <w:b/>
+        </w:rPr>
+        <w:tab/>
+      </w:r>
+      <w:r>
+        <w:rPr>
+          <w:b/>
+        </w:rPr>
+        <w:tab/>
+      </w:r>
+      <w:r>
+        <w:rPr>
+          <w:b/>
+        </w:rPr>
+        <w:tab/>
+      </w:r>
+      <w:r>
+        <w:rPr>
+          <w:b/>
+        </w:rPr>
+        <w:tab/>
+        <w:t>Date</w:t>
+      </w:r>
+    </w:p>
+    <w:p>
+      <w:pPr>
+        <w:widowControl/>
+        <w:ind w:right="-270"/>
+      </w:pPr>
+    </w:p>
+    <w:p>
+      <w:pPr>
+        <w:pStyle w:val="BodyText2"/>
+        <w:ind w:right="-270"/>
+      </w:pPr>
+      <w:r>
+        <w:t xml:space="preserve">(Authors who are </w:t>
+      </w:r>
       <w:smartTag w:uri="urn:schemas-microsoft-com:office:smarttags" w:element="country-region">
         <w:smartTag w:uri="urn:schemas-microsoft-com:office:smarttags" w:element="place">
           <w:r>
@@ -753,137 +844,6 @@
         </w:smartTag>
       </w:smartTag>
       <w:r>
-        <w:t xml:space="preserve"> government employees and prepared the Work on a subject within the scope of their official duties.  As such, the Work is not subject to </w:t>
-      </w:r>
-      <w:smartTag w:uri="urn:schemas-microsoft-com:office:smarttags" w:element="country-region">
-        <w:smartTag w:uri="urn:schemas-microsoft-com:office:smarttags" w:element="place">
-          <w:r>
-            <w:t>U.S.</w:t>
-          </w:r>
-        </w:smartTag>
-      </w:smartTag>
-      <w:r>
-        <w:t xml:space="preserve"> copyright protection.</w:t>
-      </w:r>
-    </w:p>
-    <w:p>
-      <w:pPr>
-        <w:pStyle w:val="EndnoteText"/>
-        <w:widowControl/>
-        <w:ind w:right="-270"/>
-        <w:rPr>
-          <w:sz w:val="18"/>
-        </w:rPr>
-      </w:pPr>
-    </w:p>
-    <w:p>
-      <w:pPr>
-        <w:widowControl/>
-        <w:ind w:right="-270"/>
-        <w:rPr>
-          <w:b/>
-        </w:rPr>
-      </w:pPr>
-      <w:r>
-        <w:rPr>
-          <w:b/>
-        </w:rPr>
-        <w:t>(2)_____________________________________________________________</w:t>
-      </w:r>
-      <w:r>
-        <w:rPr>
-          <w:b/>
-        </w:rPr>
-        <w:tab/>
-      </w:r>
-      <w:r>
-        <w:rPr>
-          <w:b/>
-        </w:rPr>
-        <w:tab/>
-        <w:t>___________________________________</w:t>
-      </w:r>
-    </w:p>
-    <w:p>
-      <w:pPr>
-        <w:widowControl/>
-        <w:ind w:right="-270" w:firstLine="270"/>
-        <w:rPr>
-          <w:b/>
-        </w:rPr>
-      </w:pPr>
-      <w:r>
-        <w:rPr>
-          <w:b/>
-        </w:rPr>
-        <w:t xml:space="preserve">Authorized Signature </w:t>
-      </w:r>
-      <w:r>
-        <w:rPr>
-          <w:b/>
-        </w:rPr>
-        <w:tab/>
-      </w:r>
-      <w:r>
-        <w:rPr>
-          <w:b/>
-        </w:rPr>
-        <w:tab/>
-      </w:r>
-      <w:r>
-        <w:rPr>
-          <w:b/>
-        </w:rPr>
-        <w:tab/>
-      </w:r>
-      <w:r>
-        <w:rPr>
-          <w:b/>
-        </w:rPr>
-        <w:tab/>
-      </w:r>
-      <w:r>
-        <w:rPr>
-          <w:b/>
-        </w:rPr>
-        <w:tab/>
-      </w:r>
-      <w:r>
-        <w:rPr>
-          <w:b/>
-        </w:rPr>
-        <w:tab/>
-      </w:r>
-      <w:r>
-        <w:rPr>
-          <w:b/>
-        </w:rPr>
-        <w:tab/>
-        <w:t>Date</w:t>
-      </w:r>
-    </w:p>
-    <w:p>
-      <w:pPr>
-        <w:widowControl/>
-        <w:ind w:right="-270"/>
-      </w:pPr>
-    </w:p>
-    <w:p>
-      <w:pPr>
-        <w:pStyle w:val="BodyText2"/>
-        <w:ind w:right="-270"/>
-      </w:pPr>
-      <w:r>
-        <w:t xml:space="preserve">(Authors who are </w:t>
-      </w:r>
-      <w:smartTag w:uri="urn:schemas-microsoft-com:office:smarttags" w:element="place">
-        <w:smartTag w:uri="urn:schemas-microsoft-com:office:smarttags" w:element="country-region">
-          <w:r>
-            <w:t>U.S.</w:t>
-          </w:r>
-        </w:smartTag>
-      </w:smartTag>
-      <w:r>
         <w:t xml:space="preserve"> government employees should also sign signature line (1) above to enable the IEEE to claim and protect its copyright in international jurisdictions.)</w:t>
       </w:r>
     </w:p>
@@ -1198,6 +1158,7 @@
         <w:rPr>
           <w:sz w:val="20"/>
         </w:rPr>
+        <w:lastRenderedPageBreak/>
         <w:t>RETAINED RIGHTS/TERMS AND CONDITIONS</w:t>
       </w:r>
     </w:p>
@@ -1341,12 +1302,7 @@
       <w:pPr>
         <w:pStyle w:val="ListNumber1"/>
         <w:widowControl/>
-        <w:numPr>
-          <w:ilvl w:val="0"/>
-          <w:numId w:val="0"/>
-        </w:numPr>
         <w:spacing w:after="0"/>
-        <w:ind w:left="720" w:hanging="720"/>
         <w:jc w:val="both"/>
         <w:rPr>
           <w:sz w:val="18"/>
@@ -1357,11 +1313,8 @@
       <w:pPr>
         <w:pStyle w:val="ListNumber1"/>
         <w:widowControl/>
-        <w:numPr>
-          <w:ilvl w:val="0"/>
-          <w:numId w:val="0"/>
-        </w:numPr>
         <w:spacing w:after="0"/>
+        <w:ind w:left="0" w:firstLine="0"/>
         <w:jc w:val="both"/>
         <w:rPr>
           <w:sz w:val="18"/>
@@ -1799,7 +1752,7 @@
       <w:rPr>
         <w:noProof/>
       </w:rPr>
-      <w:object w:dxaOrig="0" w:dyaOrig="0" w14:anchorId="4B6D0584">
+      <w:object w:dxaOrig="1440" w:dyaOrig="1440" w14:anchorId="4B6D0584">
         <v:shapetype id="_x0000_t75" coordsize="21600,21600" o:spt="75" o:preferrelative="t" path="m@4@5l@4@11@9@11@9@5xe" filled="f" stroked="f">
           <v:stroke joinstyle="miter"/>
           <v:formulas>
@@ -1822,7 +1775,7 @@
         <v:shape id="_x0000_s1027" type="#_x0000_t75" style="position:absolute;margin-left:93.6pt;margin-top:303.6pt;width:338.4pt;height:112.8pt;z-index:251658240;visibility:visible;mso-wrap-edited:f" o:allowincell="f" fillcolor="window">
           <v:imagedata r:id="rId1" o:title="" gain="19661f" blacklevel="29491f"/>
         </v:shape>
-        <o:OLEObject Type="Embed" ProgID="Word.Picture.8" ShapeID="_x0000_s1027" DrawAspect="Content" ObjectID="_1837107840" r:id="rId2"/>
+        <o:OLEObject Type="Embed" ProgID="Word.Picture.8" ShapeID="_x0000_s1027" DrawAspect="Content" ObjectID="_1837108415" r:id="rId2"/>
       </w:object>
     </w:r>
   </w:p>
@@ -3148,6 +3101,50 @@
     <w:lsdException w:name="Subtitle" w:qFormat="1"/>
     <w:lsdException w:name="Strong" w:qFormat="1"/>
     <w:lsdException w:name="Emphasis" w:qFormat="1"/>
+    <w:lsdException w:name="Normal Table" w:semiHidden="1" w:unhideWhenUsed="1"/>
+    <w:lsdException w:name="Table Simple 1" w:semiHidden="1" w:unhideWhenUsed="1"/>
+    <w:lsdException w:name="Table Simple 2" w:semiHidden="1" w:unhideWhenUsed="1"/>
+    <w:lsdException w:name="Table Simple 3" w:semiHidden="1" w:unhideWhenUsed="1"/>
+    <w:lsdException w:name="Table Classic 1" w:semiHidden="1" w:unhideWhenUsed="1"/>
+    <w:lsdException w:name="Table Classic 2" w:semiHidden="1" w:unhideWhenUsed="1"/>
+    <w:lsdException w:name="Table Classic 3" w:semiHidden="1" w:unhideWhenUsed="1"/>
+    <w:lsdException w:name="Table Classic 4" w:semiHidden="1" w:unhideWhenUsed="1"/>
+    <w:lsdException w:name="Table Colorful 1" w:semiHidden="1" w:unhideWhenUsed="1"/>
+    <w:lsdException w:name="Table Colorful 2" w:semiHidden="1" w:unhideWhenUsed="1"/>
+    <w:lsdException w:name="Table Colorful 3" w:semiHidden="1" w:unhideWhenUsed="1"/>
+    <w:lsdException w:name="Table Columns 1" w:semiHidden="1" w:unhideWhenUsed="1"/>
+    <w:lsdException w:name="Table Columns 2" w:semiHidden="1" w:unhideWhenUsed="1"/>
+    <w:lsdException w:name="Table Columns 3" w:semiHidden="1" w:unhideWhenUsed="1"/>
+    <w:lsdException w:name="Table Columns 4" w:semiHidden="1" w:unhideWhenUsed="1"/>
+    <w:lsdException w:name="Table Columns 5" w:semiHidden="1" w:unhideWhenUsed="1"/>
+    <w:lsdException w:name="Table Grid 1" w:semiHidden="1" w:unhideWhenUsed="1"/>
+    <w:lsdException w:name="Table Grid 2" w:semiHidden="1" w:unhideWhenUsed="1"/>
+    <w:lsdException w:name="Table Grid 3" w:semiHidden="1" w:unhideWhenUsed="1"/>
+    <w:lsdException w:name="Table Grid 4" w:semiHidden="1" w:unhideWhenUsed="1"/>
+    <w:lsdException w:name="Table Grid 5" w:semiHidden="1" w:unhideWhenUsed="1"/>
+    <w:lsdException w:name="Table Grid 6" w:semiHidden="1" w:unhideWhenUsed="1"/>
+    <w:lsdException w:name="Table Grid 7" w:semiHidden="1" w:unhideWhenUsed="1"/>
+    <w:lsdException w:name="Table Grid 8" w:semiHidden="1" w:unhideWhenUsed="1"/>
+    <w:lsdException w:name="Table List 1" w:semiHidden="1" w:unhideWhenUsed="1"/>
+    <w:lsdException w:name="Table List 2" w:semiHidden="1" w:unhideWhenUsed="1"/>
+    <w:lsdException w:name="Table List 3" w:semiHidden="1" w:unhideWhenUsed="1"/>
+    <w:lsdException w:name="Table List 4" w:semiHidden="1" w:unhideWhenUsed="1"/>
+    <w:lsdException w:name="Table List 5" w:semiHidden="1" w:unhideWhenUsed="1"/>
+    <w:lsdException w:name="Table List 6" w:semiHidden="1" w:unhideWhenUsed="1"/>
+    <w:lsdException w:name="Table List 7" w:semiHidden="1" w:unhideWhenUsed="1"/>
+    <w:lsdException w:name="Table List 8" w:semiHidden="1" w:unhideWhenUsed="1"/>
+    <w:lsdException w:name="Table 3D effects 1" w:semiHidden="1" w:unhideWhenUsed="1"/>
+    <w:lsdException w:name="Table 3D effects 2" w:semiHidden="1" w:unhideWhenUsed="1"/>
+    <w:lsdException w:name="Table 3D effects 3" w:semiHidden="1" w:unhideWhenUsed="1"/>
+    <w:lsdException w:name="Table Contemporary" w:semiHidden="1" w:unhideWhenUsed="1"/>
+    <w:lsdException w:name="Table Elegant" w:semiHidden="1" w:unhideWhenUsed="1"/>
+    <w:lsdException w:name="Table Professional" w:semiHidden="1" w:unhideWhenUsed="1"/>
+    <w:lsdException w:name="Table Subtle 1" w:semiHidden="1" w:unhideWhenUsed="1"/>
+    <w:lsdException w:name="Table Subtle 2" w:semiHidden="1" w:unhideWhenUsed="1"/>
+    <w:lsdException w:name="Table Web 1" w:semiHidden="1" w:unhideWhenUsed="1"/>
+    <w:lsdException w:name="Table Web 2" w:semiHidden="1" w:unhideWhenUsed="1"/>
+    <w:lsdException w:name="Table Web 3" w:semiHidden="1" w:unhideWhenUsed="1"/>
+    <w:lsdException w:name="Table Theme" w:semiHidden="1" w:unhideWhenUsed="1"/>
     <w:lsdException w:name="Placeholder Text" w:semiHidden="1" w:uiPriority="99"/>
     <w:lsdException w:name="No Spacing" w:uiPriority="1" w:qFormat="1"/>
     <w:lsdException w:name="Light Shading" w:uiPriority="60"/>
@@ -3471,11 +3468,15 @@
   </w:style>
   <w:style w:type="character" w:default="1" w:styleId="DefaultParagraphFont">
     <w:name w:val="Default Paragraph Font"/>
+    <w:uiPriority w:val="1"/>
     <w:semiHidden/>
+    <w:unhideWhenUsed/>
   </w:style>
   <w:style w:type="table" w:default="1" w:styleId="TableNormal">
     <w:name w:val="Normal Table"/>
+    <w:uiPriority w:val="99"/>
     <w:semiHidden/>
+    <w:unhideWhenUsed/>
     <w:tblPr>
       <w:tblInd w:w="0" w:type="dxa"/>
       <w:tblCellMar>
@@ -3488,7 +3489,9 @@
   </w:style>
   <w:style w:type="numbering" w:default="1" w:styleId="NoList">
     <w:name w:val="No List"/>
+    <w:uiPriority w:val="99"/>
     <w:semiHidden/>
+    <w:unhideWhenUsed/>
   </w:style>
   <w:style w:type="paragraph" w:customStyle="1" w:styleId="Heading">
     <w:name w:val="Heading"/>
@@ -4210,8 +4213,8 @@
       <w:sz w:val="24"/>
     </w:rPr>
   </w:style>
-  <w:style w:type="paragraph" w:customStyle="1" w:styleId="Quote">
-    <w:name w:val="Quote"/>
+  <w:style w:type="paragraph" w:customStyle="1" w:styleId="Quote1">
+    <w:name w:val="Quote1"/>
     <w:aliases w:val="q"/>
     <w:basedOn w:val="Normal"/>
     <w:next w:val="Normal"/>
@@ -4234,7 +4237,7 @@
   <w:style w:type="paragraph" w:customStyle="1" w:styleId="QuoteDoubleSpace">
     <w:name w:val="Quote DoubleSpace"/>
     <w:aliases w:val="qd"/>
-    <w:basedOn w:val="Quote"/>
+    <w:basedOn w:val="Quote1"/>
     <w:next w:val="Normal"/>
     <w:pPr>
       <w:spacing w:line="480" w:lineRule="auto"/>

</xml_diff>